<commit_message>
TS 6.1-6.6 Tamil Pada Paatam final loaded
</commit_message>
<xml_diff>
--- a/TS-Padam/TS-6.1/TS 6.1 Tamil Pada Paatam Corrections.docx
+++ b/TS-Padam/TS-6.1/TS 6.1 Tamil Pada Paatam Corrections.docx
@@ -43,7 +43,7 @@
           <w:szCs w:val="32"/>
           <w:u w:val="single"/>
         </w:rPr>
-        <w:t xml:space="preserve"> corrections – Observed till </w:t>
+        <w:t xml:space="preserve"> corrections – Observed till</w:t>
       </w:r>
       <w:r>
         <w:rPr>
@@ -51,10 +51,9 @@
           <w:bCs/>
           <w:sz w:val="32"/>
           <w:szCs w:val="32"/>
-          <w:highlight w:val="red"/>
           <w:u w:val="single"/>
         </w:rPr>
-        <w:t>?????</w:t>
+        <w:t xml:space="preserve"> 30th April 2026</w:t>
       </w:r>
     </w:p>
     <w:p>
@@ -106,12 +105,16 @@
               <w:ind w:right="-136"/>
               <w:jc w:val="center"/>
               <w:rPr>
+                <w:b/>
+                <w:bCs/>
                 <w:sz w:val="32"/>
                 <w:szCs w:val="32"/>
               </w:rPr>
             </w:pPr>
             <w:r>
               <w:rPr>
+                <w:b/>
+                <w:bCs/>
                 <w:sz w:val="32"/>
                 <w:szCs w:val="32"/>
               </w:rPr>
@@ -124,12 +127,16 @@
               <w:ind w:right="-136"/>
               <w:jc w:val="center"/>
               <w:rPr>
+                <w:b/>
+                <w:bCs/>
                 <w:sz w:val="32"/>
                 <w:szCs w:val="32"/>
               </w:rPr>
             </w:pPr>
             <w:r>
               <w:rPr>
+                <w:b/>
+                <w:bCs/>
                 <w:sz w:val="32"/>
                 <w:szCs w:val="32"/>
               </w:rPr>
@@ -147,12 +154,16 @@
               <w:ind w:right="-136"/>
               <w:jc w:val="center"/>
               <w:rPr>
+                <w:b/>
+                <w:bCs/>
                 <w:sz w:val="32"/>
                 <w:szCs w:val="32"/>
               </w:rPr>
             </w:pPr>
             <w:r>
               <w:rPr>
+                <w:b/>
+                <w:bCs/>
                 <w:sz w:val="32"/>
                 <w:szCs w:val="32"/>
               </w:rPr>
@@ -171,12 +182,16 @@
               <w:ind w:right="-18"/>
               <w:jc w:val="center"/>
               <w:rPr>
+                <w:b/>
+                <w:bCs/>
                 <w:sz w:val="32"/>
                 <w:szCs w:val="32"/>
               </w:rPr>
             </w:pPr>
             <w:r>
               <w:rPr>
+                <w:b/>
+                <w:bCs/>
                 <w:sz w:val="32"/>
                 <w:szCs w:val="32"/>
               </w:rPr>
@@ -2087,6 +2102,30 @@
           <w:u w:val="single"/>
         </w:rPr>
       </w:pPr>
+    </w:p>
+    <w:p>
+      <w:pPr>
+        <w:jc w:val="center"/>
+        <w:rPr>
+          <w:b/>
+          <w:bCs/>
+          <w:sz w:val="32"/>
+          <w:szCs w:val="32"/>
+          <w:u w:val="single"/>
+        </w:rPr>
+      </w:pPr>
+    </w:p>
+    <w:p>
+      <w:pPr>
+        <w:jc w:val="center"/>
+        <w:rPr>
+          <w:b/>
+          <w:bCs/>
+          <w:sz w:val="32"/>
+          <w:szCs w:val="32"/>
+          <w:u w:val="single"/>
+        </w:rPr>
+      </w:pPr>
       <w:r>
         <w:rPr>
           <w:b/>
@@ -2095,6 +2134,7 @@
           <w:szCs w:val="32"/>
           <w:u w:val="single"/>
         </w:rPr>
+        <w:lastRenderedPageBreak/>
         <w:t xml:space="preserve">TS Pada Paatam – TS 6.1 </w:t>
       </w:r>
       <w:r>
@@ -2194,7 +2234,6 @@
                 <w:szCs w:val="32"/>
                 <w:lang w:bidi="ta-IN"/>
               </w:rPr>
-              <w:lastRenderedPageBreak/>
               <w:t>Section, Paragraph</w:t>
             </w:r>
           </w:p>
@@ -3843,6 +3882,7 @@
                 <w:sz w:val="28"/>
                 <w:szCs w:val="28"/>
               </w:rPr>
+              <w:lastRenderedPageBreak/>
               <w:t>TS 6.1.3.8  - Vaakyam</w:t>
             </w:r>
           </w:p>
@@ -4332,7 +4372,6 @@
                 <w:sz w:val="28"/>
                 <w:szCs w:val="28"/>
               </w:rPr>
-              <w:lastRenderedPageBreak/>
               <w:t>TS 6.1.5.3  - Vaakyam</w:t>
             </w:r>
           </w:p>
@@ -7275,6 +7314,7 @@
                 <w:sz w:val="28"/>
                 <w:szCs w:val="28"/>
               </w:rPr>
+              <w:lastRenderedPageBreak/>
               <w:t>TS 6.1.</w:t>
             </w:r>
             <w:r>
@@ -7776,7 +7816,6 @@
                 <w:sz w:val="28"/>
                 <w:szCs w:val="28"/>
               </w:rPr>
-              <w:lastRenderedPageBreak/>
               <w:t>TS 6.1.9.1 - Padam</w:t>
             </w:r>
           </w:p>
@@ -11059,6 +11098,7 @@
                 <w:sz w:val="28"/>
                 <w:szCs w:val="28"/>
               </w:rPr>
+              <w:lastRenderedPageBreak/>
               <w:t>TS 6.1.11.2  - Vaakyam</w:t>
             </w:r>
           </w:p>
@@ -11433,17 +11473,6 @@
           <w:szCs w:val="32"/>
           <w:u w:val="single"/>
         </w:rPr>
-        <w:br w:type="page"/>
-      </w:r>
-      <w:r>
-        <w:rPr>
-          <w:b/>
-          <w:bCs/>
-          <w:sz w:val="32"/>
-          <w:szCs w:val="32"/>
-          <w:u w:val="single"/>
-        </w:rPr>
-        <w:lastRenderedPageBreak/>
         <w:t>TS Pada Paatam – TS 6.1 Tamil co</w:t>
       </w:r>
       <w:r>
@@ -14107,7 +14136,6 @@
                 <w:sz w:val="28"/>
                 <w:szCs w:val="28"/>
               </w:rPr>
-              <w:lastRenderedPageBreak/>
               <w:t>TS 6.1.11.4 - Padam</w:t>
             </w:r>
           </w:p>
@@ -14935,17 +14963,6 @@
           <w:szCs w:val="32"/>
           <w:u w:val="single"/>
         </w:rPr>
-        <w:br w:type="page"/>
-      </w:r>
-      <w:r>
-        <w:rPr>
-          <w:b/>
-          <w:bCs/>
-          <w:sz w:val="32"/>
-          <w:szCs w:val="32"/>
-          <w:u w:val="single"/>
-        </w:rPr>
-        <w:lastRenderedPageBreak/>
         <w:t>TS</w:t>
       </w:r>
       <w:r>
@@ -15723,7 +15740,7 @@
       <w:pBdr>
         <w:top w:val="single" w:sz="4" w:space="1" w:color="auto"/>
       </w:pBdr>
-      <w:jc w:val="center"/>
+      <w:jc w:val="right"/>
       <w:rPr>
         <w:b/>
         <w:bCs/>
@@ -15756,7 +15773,21 @@
         <w:bCs/>
       </w:rPr>
       <w:tab/>
-      <w:t xml:space="preserve">             </w:t>
+      <w:t xml:space="preserve">     </w:t>
+    </w:r>
+    <w:r>
+      <w:rPr>
+        <w:b/>
+        <w:bCs/>
+      </w:rPr>
+      <w:t xml:space="preserve">           </w:t>
+    </w:r>
+    <w:r>
+      <w:rPr>
+        <w:b/>
+        <w:bCs/>
+      </w:rPr>
+      <w:t xml:space="preserve">        </w:t>
     </w:r>
     <w:r>
       <w:rPr>
@@ -15890,6 +15921,7 @@
       <w:pBdr>
         <w:top w:val="single" w:sz="4" w:space="1" w:color="auto"/>
       </w:pBdr>
+      <w:jc w:val="right"/>
       <w:rPr>
         <w:b/>
         <w:bCs/>
@@ -15942,6 +15974,13 @@
         <w:b/>
         <w:bCs/>
       </w:rPr>
+      <w:t xml:space="preserve">       </w:t>
+    </w:r>
+    <w:r>
+      <w:rPr>
+        <w:b/>
+        <w:bCs/>
+      </w:rPr>
       <w:t>v</w:t>
     </w:r>
     <w:r>
@@ -15974,6 +16013,9 @@
     </w:r>
     <w:r>
       <w:tab/>
+    </w:r>
+    <w:r>
+      <w:t xml:space="preserve">           </w:t>
     </w:r>
     <w:r>
       <w:rPr>

</xml_diff>